<commit_message>
feat: add test script generation, execution hooks, and coverage reporting (POB-202, 203, 204, 205)
</commit_message>
<xml_diff>
--- a/e2e-test-report.docx
+++ b/e2e-test-report.docx
@@ -4,32 +4,214 @@
   <w:body>
     <w:p>
       <w:pPr>
-        <w:pStyle w:val="Heading1"/>
+        <w:pStyle w:val="Title"/>
         <w:jc w:val="center"/>
       </w:pPr>
       <w:r>
-        <w:t>E2E Test Report — TesAxrail App</w:t>
+        <w:t>E2E Test Report</w:t>
       </w:r>
     </w:p>
     <w:p>
+      <w:pPr>
+        <w:jc w:val="center"/>
+      </w:pPr>
       <w:r>
-        <w:t>Device: Pixel 7 (Android 17, emulator-5554)</w:t>
-      </w:r>
-    </w:p>
-    <w:p>
-      <w:r>
-        <w:t>Date: 2026-05-22 00:13</w:t>
-      </w:r>
-    </w:p>
-    <w:p>
-      <w:r>
-        <w:t>Results: 5/5 passed, 0 failed</w:t>
+        <w:rPr>
+          <w:color w:val="666666"/>
+          <w:sz w:val="28"/>
+        </w:rPr>
+        <w:t>Axrail Test App - Android</w:t>
       </w:r>
     </w:p>
     <w:p/>
     <w:p>
       <w:pPr>
-        <w:pStyle w:val="Heading2"/>
+        <w:pStyle w:val="Heading1"/>
+      </w:pPr>
+      <w:r>
+        <w:t>Executive Summary</w:t>
+      </w:r>
+    </w:p>
+    <w:tbl>
+      <w:tblPr>
+        <w:tblStyle w:val="LightGrid-Accent1"/>
+        <w:tblW w:type="auto" w:w="0"/>
+        <w:tblLook w:firstColumn="1" w:firstRow="1" w:lastColumn="0" w:lastRow="0" w:noHBand="0" w:noVBand="1" w:val="04A0"/>
+      </w:tblPr>
+      <w:tblGrid>
+        <w:gridCol w:w="4320"/>
+        <w:gridCol w:w="4320"/>
+      </w:tblGrid>
+      <w:tr>
+        <w:tc>
+          <w:tcPr>
+            <w:tcW w:type="dxa" w:w="4320"/>
+          </w:tcPr>
+          <w:p>
+            <w:r>
+              <w:t>Device</w:t>
+            </w:r>
+          </w:p>
+        </w:tc>
+        <w:tc>
+          <w:tcPr>
+            <w:tcW w:type="dxa" w:w="4320"/>
+          </w:tcPr>
+          <w:p>
+            <w:r>
+              <w:t>Pixel 7 (emulator-5556)</w:t>
+            </w:r>
+          </w:p>
+        </w:tc>
+      </w:tr>
+      <w:tr>
+        <w:tc>
+          <w:tcPr>
+            <w:tcW w:type="dxa" w:w="4320"/>
+          </w:tcPr>
+          <w:p>
+            <w:r>
+              <w:t>Platform</w:t>
+            </w:r>
+          </w:p>
+        </w:tc>
+        <w:tc>
+          <w:tcPr>
+            <w:tcW w:type="dxa" w:w="4320"/>
+          </w:tcPr>
+          <w:p>
+            <w:r>
+              <w:t>Android 17 (Emulator)</w:t>
+            </w:r>
+          </w:p>
+        </w:tc>
+      </w:tr>
+      <w:tr>
+        <w:tc>
+          <w:tcPr>
+            <w:tcW w:type="dxa" w:w="4320"/>
+          </w:tcPr>
+          <w:p>
+            <w:r>
+              <w:t>App Package</w:t>
+            </w:r>
+          </w:p>
+        </w:tc>
+        <w:tc>
+          <w:tcPr>
+            <w:tcW w:type="dxa" w:w="4320"/>
+          </w:tcPr>
+          <w:p>
+            <w:r>
+              <w:t>com.example.tesaxrail</w:t>
+            </w:r>
+          </w:p>
+        </w:tc>
+      </w:tr>
+      <w:tr>
+        <w:tc>
+          <w:tcPr>
+            <w:tcW w:type="dxa" w:w="4320"/>
+          </w:tcPr>
+          <w:p>
+            <w:r>
+              <w:t>Test Date</w:t>
+            </w:r>
+          </w:p>
+        </w:tc>
+        <w:tc>
+          <w:tcPr>
+            <w:tcW w:type="dxa" w:w="4320"/>
+          </w:tcPr>
+          <w:p>
+            <w:r>
+              <w:t>2026-06-08 11:45:39</w:t>
+            </w:r>
+          </w:p>
+        </w:tc>
+      </w:tr>
+      <w:tr>
+        <w:tc>
+          <w:tcPr>
+            <w:tcW w:type="dxa" w:w="4320"/>
+          </w:tcPr>
+          <w:p>
+            <w:r>
+              <w:t>Total Tests</w:t>
+            </w:r>
+          </w:p>
+        </w:tc>
+        <w:tc>
+          <w:tcPr>
+            <w:tcW w:type="dxa" w:w="4320"/>
+          </w:tcPr>
+          <w:p>
+            <w:r>
+              <w:t>8</w:t>
+            </w:r>
+          </w:p>
+        </w:tc>
+      </w:tr>
+      <w:tr>
+        <w:tc>
+          <w:tcPr>
+            <w:tcW w:type="dxa" w:w="4320"/>
+          </w:tcPr>
+          <w:p>
+            <w:r>
+              <w:t>Pass Rate</w:t>
+            </w:r>
+          </w:p>
+        </w:tc>
+        <w:tc>
+          <w:tcPr>
+            <w:tcW w:type="dxa" w:w="4320"/>
+          </w:tcPr>
+          <w:p>
+            <w:r>
+              <w:t>100% (8/8)</w:t>
+            </w:r>
+          </w:p>
+        </w:tc>
+      </w:tr>
+      <w:tr>
+        <w:tc>
+          <w:tcPr>
+            <w:tcW w:type="dxa" w:w="4320"/>
+          </w:tcPr>
+          <w:p>
+            <w:r>
+              <w:t>Failures</w:t>
+            </w:r>
+          </w:p>
+        </w:tc>
+        <w:tc>
+          <w:tcPr>
+            <w:tcW w:type="dxa" w:w="4320"/>
+          </w:tcPr>
+          <w:p>
+            <w:r>
+              <w:t>0</w:t>
+            </w:r>
+          </w:p>
+        </w:tc>
+      </w:tr>
+    </w:tbl>
+    <w:p/>
+    <w:p>
+      <w:r>
+        <w:rPr>
+          <w:b/>
+          <w:color w:val="008000"/>
+          <w:sz w:val="28"/>
+        </w:rPr>
+        <w:t>OVERALL RESULT: ALL TESTS PASSED ✓</w:t>
+      </w:r>
+    </w:p>
+    <w:p/>
+    <w:p>
+      <w:pPr>
+        <w:pStyle w:val="Heading1"/>
       </w:pPr>
       <w:r>
         <w:t>Test Results</w:t>
@@ -37,7 +219,7 @@
     </w:p>
     <w:tbl>
       <w:tblPr>
-        <w:tblStyle w:val="TableGrid"/>
+        <w:tblStyle w:val="LightGrid-Accent1"/>
         <w:tblW w:type="auto" w:w="0"/>
         <w:tblLook w:firstColumn="1" w:firstRow="1" w:lastColumn="0" w:lastRow="0" w:noHBand="0" w:noVBand="1" w:val="04A0"/>
       </w:tblPr>
@@ -71,7 +253,7 @@
               <w:rPr>
                 <w:b/>
               </w:rPr>
-              <w:t>Test Case</w:t>
+              <w:t>Test Name</w:t>
             </w:r>
           </w:p>
         </w:tc>
@@ -84,20 +266,7 @@
               <w:rPr>
                 <w:b/>
               </w:rPr>
-              <w:t>Expected</w:t>
-            </w:r>
-          </w:p>
-        </w:tc>
-        <w:tc>
-          <w:tcPr>
-            <w:tcW w:type="dxa" w:w="1728"/>
-          </w:tcPr>
-          <w:p>
-            <w:r>
-              <w:rPr>
-                <w:b/>
-              </w:rPr>
-              <w:t>Actual</w:t>
+              <w:t>Priority</w:t>
             </w:r>
           </w:p>
         </w:tc>
@@ -114,6 +283,19 @@
             </w:r>
           </w:p>
         </w:tc>
+        <w:tc>
+          <w:tcPr>
+            <w:tcW w:type="dxa" w:w="1728"/>
+          </w:tcPr>
+          <w:p>
+            <w:r>
+              <w:rPr>
+                <w:b/>
+              </w:rPr>
+              <w:t>Description</w:t>
+            </w:r>
+          </w:p>
+        </w:tc>
       </w:tr>
       <w:tr>
         <w:tc>
@@ -122,7 +304,59 @@
           </w:tcPr>
           <w:p>
             <w:r>
-              <w:t>1</w:t>
+              <w:t>01</w:t>
+            </w:r>
+          </w:p>
+        </w:tc>
+        <w:tc>
+          <w:tcPr>
+            <w:tcW w:type="dxa" w:w="1728"/>
+          </w:tcPr>
+          <w:p>
+            <w:r>
+              <w:t>App Launch</w:t>
+            </w:r>
+          </w:p>
+        </w:tc>
+        <w:tc>
+          <w:tcPr>
+            <w:tcW w:type="dxa" w:w="1728"/>
+          </w:tcPr>
+          <w:p>
+            <w:r>
+              <w:t>CRITICAL</w:t>
+            </w:r>
+          </w:p>
+        </w:tc>
+        <w:tc>
+          <w:tcPr>
+            <w:tcW w:type="dxa" w:w="1728"/>
+          </w:tcPr>
+          <w:p>
+            <w:r>
+              <w:t>PASS</w:t>
+            </w:r>
+          </w:p>
+        </w:tc>
+        <w:tc>
+          <w:tcPr>
+            <w:tcW w:type="dxa" w:w="1728"/>
+          </w:tcPr>
+          <w:p>
+            <w:r>
+              <w:t>Verify the app starts and shows the main screen with all sections visible</w:t>
+            </w:r>
+          </w:p>
+        </w:tc>
+      </w:tr>
+      <w:tr>
+        <w:tc>
+          <w:tcPr>
+            <w:tcW w:type="dxa" w:w="1728"/>
+          </w:tcPr>
+          <w:p>
+            <w:r>
+              <w:t>02</w:t>
             </w:r>
           </w:p>
         </w:tc>
@@ -142,7 +376,7 @@
           </w:tcPr>
           <w:p>
             <w:r>
-              <w:t>"Hello, Kiro!" appears</w:t>
+              <w:t>HIGH</w:t>
             </w:r>
           </w:p>
         </w:tc>
@@ -152,7 +386,7 @@
           </w:tcPr>
           <w:p>
             <w:r>
-              <w:t>"Hello, Kiro!" appeared</w:t>
+              <w:t>PASS</w:t>
             </w:r>
           </w:p>
         </w:tc>
@@ -162,7 +396,7 @@
           </w:tcPr>
           <w:p>
             <w:r>
-              <w:t>✅ PASS</w:t>
+              <w:t>Type a name, tap Say Hello, and verify greeting appears</w:t>
             </w:r>
           </w:p>
         </w:tc>
@@ -174,7 +408,7 @@
           </w:tcPr>
           <w:p>
             <w:r>
-              <w:t>2</w:t>
+              <w:t>03</w:t>
             </w:r>
           </w:p>
         </w:tc>
@@ -184,7 +418,7 @@
           </w:tcPr>
           <w:p>
             <w:r>
-              <w:t>Counter Increment (x3)</w:t>
+              <w:t>Greeting Empty Name</w:t>
             </w:r>
           </w:p>
         </w:tc>
@@ -194,7 +428,7 @@
           </w:tcPr>
           <w:p>
             <w:r>
-              <w:t>Counter: 3</w:t>
+              <w:t>MEDIUM</w:t>
             </w:r>
           </w:p>
         </w:tc>
@@ -204,7 +438,7 @@
           </w:tcPr>
           <w:p>
             <w:r>
-              <w:t>Counter: 3</w:t>
+              <w:t>PASS</w:t>
             </w:r>
           </w:p>
         </w:tc>
@@ -214,7 +448,7 @@
           </w:tcPr>
           <w:p>
             <w:r>
-              <w:t>✅ PASS</w:t>
+              <w:t>Tap Say Hello without entering a name and verify output</w:t>
             </w:r>
           </w:p>
         </w:tc>
@@ -226,7 +460,59 @@
           </w:tcPr>
           <w:p>
             <w:r>
-              <w:t>3</w:t>
+              <w:t>04</w:t>
+            </w:r>
+          </w:p>
+        </w:tc>
+        <w:tc>
+          <w:tcPr>
+            <w:tcW w:type="dxa" w:w="1728"/>
+          </w:tcPr>
+          <w:p>
+            <w:r>
+              <w:t>Counter Increment</w:t>
+            </w:r>
+          </w:p>
+        </w:tc>
+        <w:tc>
+          <w:tcPr>
+            <w:tcW w:type="dxa" w:w="1728"/>
+          </w:tcPr>
+          <w:p>
+            <w:r>
+              <w:t>HIGH</w:t>
+            </w:r>
+          </w:p>
+        </w:tc>
+        <w:tc>
+          <w:tcPr>
+            <w:tcW w:type="dxa" w:w="1728"/>
+          </w:tcPr>
+          <w:p>
+            <w:r>
+              <w:t>PASS</w:t>
+            </w:r>
+          </w:p>
+        </w:tc>
+        <w:tc>
+          <w:tcPr>
+            <w:tcW w:type="dxa" w:w="1728"/>
+          </w:tcPr>
+          <w:p>
+            <w:r>
+              <w:t>Tap the +1 button multiple times and verify counter updates</w:t>
+            </w:r>
+          </w:p>
+        </w:tc>
+      </w:tr>
+      <w:tr>
+        <w:tc>
+          <w:tcPr>
+            <w:tcW w:type="dxa" w:w="1728"/>
+          </w:tcPr>
+          <w:p>
+            <w:r>
+              <w:t>05</w:t>
             </w:r>
           </w:p>
         </w:tc>
@@ -246,7 +532,7 @@
           </w:tcPr>
           <w:p>
             <w:r>
-              <w:t>Counter: 2</w:t>
+              <w:t>HIGH</w:t>
             </w:r>
           </w:p>
         </w:tc>
@@ -256,7 +542,7 @@
           </w:tcPr>
           <w:p>
             <w:r>
-              <w:t>Counter: 2</w:t>
+              <w:t>PASS</w:t>
             </w:r>
           </w:p>
         </w:tc>
@@ -266,7 +552,7 @@
           </w:tcPr>
           <w:p>
             <w:r>
-              <w:t>✅ PASS</w:t>
+              <w:t>Tap the -1 button and verify counter decreases, including negative values</w:t>
             </w:r>
           </w:p>
         </w:tc>
@@ -278,7 +564,7 @@
           </w:tcPr>
           <w:p>
             <w:r>
-              <w:t>4</w:t>
+              <w:t>06</w:t>
             </w:r>
           </w:p>
         </w:tc>
@@ -298,7 +584,7 @@
           </w:tcPr>
           <w:p>
             <w:r>
-              <w:t>Counter: 0</w:t>
+              <w:t>HIGH</w:t>
             </w:r>
           </w:p>
         </w:tc>
@@ -308,7 +594,7 @@
           </w:tcPr>
           <w:p>
             <w:r>
-              <w:t>Counter: 0</w:t>
+              <w:t>PASS</w:t>
             </w:r>
           </w:p>
         </w:tc>
@@ -318,7 +604,7 @@
           </w:tcPr>
           <w:p>
             <w:r>
-              <w:t>✅ PASS</w:t>
+              <w:t>Increment counter, then tap Reset and verify it returns to 0</w:t>
             </w:r>
           </w:p>
         </w:tc>
@@ -330,7 +616,7 @@
           </w:tcPr>
           <w:p>
             <w:r>
-              <w:t>5</w:t>
+              <w:t>07</w:t>
             </w:r>
           </w:p>
         </w:tc>
@@ -340,7 +626,7 @@
           </w:tcPr>
           <w:p>
             <w:r>
-              <w:t>Negative Counter</w:t>
+              <w:t>Greeting Special Characters</w:t>
             </w:r>
           </w:p>
         </w:tc>
@@ -350,7 +636,7 @@
           </w:tcPr>
           <w:p>
             <w:r>
-              <w:t>Counter: -1</w:t>
+              <w:t>MEDIUM</w:t>
             </w:r>
           </w:p>
         </w:tc>
@@ -360,7 +646,7 @@
           </w:tcPr>
           <w:p>
             <w:r>
-              <w:t>Counter: -1</w:t>
+              <w:t>PASS</w:t>
             </w:r>
           </w:p>
         </w:tc>
@@ -370,7 +656,59 @@
           </w:tcPr>
           <w:p>
             <w:r>
-              <w:t>✅ PASS</w:t>
+              <w:t>Type a name with special characters and verify greeting renders correctly</w:t>
+            </w:r>
+          </w:p>
+        </w:tc>
+      </w:tr>
+      <w:tr>
+        <w:tc>
+          <w:tcPr>
+            <w:tcW w:type="dxa" w:w="1728"/>
+          </w:tcPr>
+          <w:p>
+            <w:r>
+              <w:t>08</w:t>
+            </w:r>
+          </w:p>
+        </w:tc>
+        <w:tc>
+          <w:tcPr>
+            <w:tcW w:type="dxa" w:w="1728"/>
+          </w:tcPr>
+          <w:p>
+            <w:r>
+              <w:t>Counter Mixed Operations</w:t>
+            </w:r>
+          </w:p>
+        </w:tc>
+        <w:tc>
+          <w:tcPr>
+            <w:tcW w:type="dxa" w:w="1728"/>
+          </w:tcPr>
+          <w:p>
+            <w:r>
+              <w:t>MEDIUM</w:t>
+            </w:r>
+          </w:p>
+        </w:tc>
+        <w:tc>
+          <w:tcPr>
+            <w:tcW w:type="dxa" w:w="1728"/>
+          </w:tcPr>
+          <w:p>
+            <w:r>
+              <w:t>PASS</w:t>
+            </w:r>
+          </w:p>
+        </w:tc>
+        <w:tc>
+          <w:tcPr>
+            <w:tcW w:type="dxa" w:w="1728"/>
+          </w:tcPr>
+          <w:p>
+            <w:r>
+              <w:t>Perform a mix of increment and decrement to verify state consistency</w:t>
             </w:r>
           </w:p>
         </w:tc>
@@ -379,22 +717,136 @@
     <w:p/>
     <w:p>
       <w:pPr>
+        <w:pStyle w:val="Heading1"/>
+      </w:pPr>
+      <w:r>
+        <w:t>Detailed Results &amp; Screenshots</w:t>
+      </w:r>
+    </w:p>
+    <w:p>
+      <w:pPr>
         <w:pStyle w:val="Heading2"/>
       </w:pPr>
       <w:r>
-        <w:t>Screenshots</w:t>
+        <w:t>Test 01: App Launch</w:t>
+      </w:r>
+    </w:p>
+    <w:tbl>
+      <w:tblPr>
+        <w:tblStyle w:val="LightGrid-Accent1"/>
+        <w:tblW w:type="auto" w:w="0"/>
+        <w:tblLook w:firstColumn="1" w:firstRow="1" w:lastColumn="0" w:lastRow="0" w:noHBand="0" w:noVBand="1" w:val="04A0"/>
+      </w:tblPr>
+      <w:tblGrid>
+        <w:gridCol w:w="4320"/>
+        <w:gridCol w:w="4320"/>
+      </w:tblGrid>
+      <w:tr>
+        <w:tc>
+          <w:tcPr>
+            <w:tcW w:type="dxa" w:w="4320"/>
+          </w:tcPr>
+          <w:p>
+            <w:r>
+              <w:t>Script</w:t>
+            </w:r>
+          </w:p>
+        </w:tc>
+        <w:tc>
+          <w:tcPr>
+            <w:tcW w:type="dxa" w:w="4320"/>
+          </w:tcPr>
+          <w:p>
+            <w:r>
+              <w:t>01-app-launch.yaml</w:t>
+            </w:r>
+          </w:p>
+        </w:tc>
+      </w:tr>
+      <w:tr>
+        <w:tc>
+          <w:tcPr>
+            <w:tcW w:type="dxa" w:w="4320"/>
+          </w:tcPr>
+          <w:p>
+            <w:r>
+              <w:t>Expected</w:t>
+            </w:r>
+          </w:p>
+        </w:tc>
+        <w:tc>
+          <w:tcPr>
+            <w:tcW w:type="dxa" w:w="4320"/>
+          </w:tcPr>
+          <w:p>
+            <w:r>
+              <w:t>All main screen elements are visible after app launch</w:t>
+            </w:r>
+          </w:p>
+        </w:tc>
+      </w:tr>
+      <w:tr>
+        <w:tc>
+          <w:tcPr>
+            <w:tcW w:type="dxa" w:w="4320"/>
+          </w:tcPr>
+          <w:p>
+            <w:r>
+              <w:t>Actual</w:t>
+            </w:r>
+          </w:p>
+        </w:tc>
+        <w:tc>
+          <w:tcPr>
+            <w:tcW w:type="dxa" w:w="4320"/>
+          </w:tcPr>
+          <w:p>
+            <w:r>
+              <w:t>All elements (title, name input, greet button, counter, +1, -1, reset) visible</w:t>
+            </w:r>
+          </w:p>
+        </w:tc>
+      </w:tr>
+      <w:tr>
+        <w:tc>
+          <w:tcPr>
+            <w:tcW w:type="dxa" w:w="4320"/>
+          </w:tcPr>
+          <w:p>
+            <w:r>
+              <w:t>Status</w:t>
+            </w:r>
+          </w:p>
+        </w:tc>
+        <w:tc>
+          <w:tcPr>
+            <w:tcW w:type="dxa" w:w="4320"/>
+          </w:tcPr>
+          <w:p>
+            <w:r>
+              <w:t>PASS</w:t>
+            </w:r>
+          </w:p>
+        </w:tc>
+      </w:tr>
+    </w:tbl>
+    <w:p/>
+    <w:p>
+      <w:pPr>
+        <w:pStyle w:val="Caption"/>
+      </w:pPr>
+      <w:r>
+        <w:t>Screenshot: e2e-android-01-app-launch-pass.png</w:t>
       </w:r>
     </w:p>
     <w:p>
-      <w:r>
-        <w:t>Initial State (fresh app launch):</w:t>
-      </w:r>
-    </w:p>
-    <w:p>
+      <w:pPr>
+        <w:jc w:val="center"/>
+      </w:pPr>
       <w:r>
         <w:drawing>
           <wp:inline xmlns:a="http://schemas.openxmlformats.org/drawingml/2006/main" xmlns:pic="http://schemas.openxmlformats.org/drawingml/2006/picture">
-            <wp:extent cx="2286000" cy="5080000"/>
+            <wp:extent cx="3657600" cy="8128000"/>
             <wp:docPr id="1" name="Picture 1"/>
             <wp:cNvGraphicFramePr>
               <a:graphicFrameLocks noChangeAspect="1"/>
@@ -403,7 +855,7 @@
               <a:graphicData uri="http://schemas.openxmlformats.org/drawingml/2006/picture">
                 <pic:pic>
                   <pic:nvPicPr>
-                    <pic:cNvPr id="0" name="e2e-android-00-initial-state.png"/>
+                    <pic:cNvPr id="0" name="e2e-android-01-app-launch-pass.png"/>
                     <pic:cNvPicPr/>
                   </pic:nvPicPr>
                   <pic:blipFill>
@@ -415,217 +867,7 @@
                   <pic:spPr>
                     <a:xfrm>
                       <a:off x="0" y="0"/>
-                      <a:ext cx="2286000" cy="5080000"/>
-                    </a:xfrm>
-                    <a:prstGeom prst="rect"/>
-                  </pic:spPr>
-                </pic:pic>
-              </a:graphicData>
-            </a:graphic>
-          </wp:inline>
-        </w:drawing>
-      </w:r>
-    </w:p>
-    <w:p/>
-    <w:p>
-      <w:r>
-        <w:t>Test #1: Greeting Flow — ✅ PASS</w:t>
-      </w:r>
-    </w:p>
-    <w:p>
-      <w:r>
-        <w:drawing>
-          <wp:inline xmlns:a="http://schemas.openxmlformats.org/drawingml/2006/main" xmlns:pic="http://schemas.openxmlformats.org/drawingml/2006/picture">
-            <wp:extent cx="2286000" cy="5080000"/>
-            <wp:docPr id="2" name="Picture 2"/>
-            <wp:cNvGraphicFramePr>
-              <a:graphicFrameLocks noChangeAspect="1"/>
-            </wp:cNvGraphicFramePr>
-            <a:graphic>
-              <a:graphicData uri="http://schemas.openxmlformats.org/drawingml/2006/picture">
-                <pic:pic>
-                  <pic:nvPicPr>
-                    <pic:cNvPr id="0" name="e2e-android-01-greeting-flow-pass.png"/>
-                    <pic:cNvPicPr/>
-                  </pic:nvPicPr>
-                  <pic:blipFill>
-                    <a:blip r:embed="rId10"/>
-                    <a:stretch>
-                      <a:fillRect/>
-                    </a:stretch>
-                  </pic:blipFill>
-                  <pic:spPr>
-                    <a:xfrm>
-                      <a:off x="0" y="0"/>
-                      <a:ext cx="2286000" cy="5080000"/>
-                    </a:xfrm>
-                    <a:prstGeom prst="rect"/>
-                  </pic:spPr>
-                </pic:pic>
-              </a:graphicData>
-            </a:graphic>
-          </wp:inline>
-        </w:drawing>
-      </w:r>
-    </w:p>
-    <w:p/>
-    <w:p>
-      <w:r>
-        <w:t>Test #2: Counter Increment (x3) — ✅ PASS</w:t>
-      </w:r>
-    </w:p>
-    <w:p>
-      <w:r>
-        <w:drawing>
-          <wp:inline xmlns:a="http://schemas.openxmlformats.org/drawingml/2006/main" xmlns:pic="http://schemas.openxmlformats.org/drawingml/2006/picture">
-            <wp:extent cx="2286000" cy="5080000"/>
-            <wp:docPr id="3" name="Picture 3"/>
-            <wp:cNvGraphicFramePr>
-              <a:graphicFrameLocks noChangeAspect="1"/>
-            </wp:cNvGraphicFramePr>
-            <a:graphic>
-              <a:graphicData uri="http://schemas.openxmlformats.org/drawingml/2006/picture">
-                <pic:pic>
-                  <pic:nvPicPr>
-                    <pic:cNvPr id="0" name="e2e-android-02-counter-increment-pass.png"/>
-                    <pic:cNvPicPr/>
-                  </pic:nvPicPr>
-                  <pic:blipFill>
-                    <a:blip r:embed="rId11"/>
-                    <a:stretch>
-                      <a:fillRect/>
-                    </a:stretch>
-                  </pic:blipFill>
-                  <pic:spPr>
-                    <a:xfrm>
-                      <a:off x="0" y="0"/>
-                      <a:ext cx="2286000" cy="5080000"/>
-                    </a:xfrm>
-                    <a:prstGeom prst="rect"/>
-                  </pic:spPr>
-                </pic:pic>
-              </a:graphicData>
-            </a:graphic>
-          </wp:inline>
-        </w:drawing>
-      </w:r>
-    </w:p>
-    <w:p/>
-    <w:p>
-      <w:r>
-        <w:t>Test #3: Counter Decrement — ✅ PASS</w:t>
-      </w:r>
-    </w:p>
-    <w:p>
-      <w:r>
-        <w:drawing>
-          <wp:inline xmlns:a="http://schemas.openxmlformats.org/drawingml/2006/main" xmlns:pic="http://schemas.openxmlformats.org/drawingml/2006/picture">
-            <wp:extent cx="2286000" cy="5080000"/>
-            <wp:docPr id="4" name="Picture 4"/>
-            <wp:cNvGraphicFramePr>
-              <a:graphicFrameLocks noChangeAspect="1"/>
-            </wp:cNvGraphicFramePr>
-            <a:graphic>
-              <a:graphicData uri="http://schemas.openxmlformats.org/drawingml/2006/picture">
-                <pic:pic>
-                  <pic:nvPicPr>
-                    <pic:cNvPr id="0" name="e2e-android-03-counter-decrement-pass.png"/>
-                    <pic:cNvPicPr/>
-                  </pic:nvPicPr>
-                  <pic:blipFill>
-                    <a:blip r:embed="rId12"/>
-                    <a:stretch>
-                      <a:fillRect/>
-                    </a:stretch>
-                  </pic:blipFill>
-                  <pic:spPr>
-                    <a:xfrm>
-                      <a:off x="0" y="0"/>
-                      <a:ext cx="2286000" cy="5080000"/>
-                    </a:xfrm>
-                    <a:prstGeom prst="rect"/>
-                  </pic:spPr>
-                </pic:pic>
-              </a:graphicData>
-            </a:graphic>
-          </wp:inline>
-        </w:drawing>
-      </w:r>
-    </w:p>
-    <w:p/>
-    <w:p>
-      <w:r>
-        <w:t>Test #4: Counter Reset — ✅ PASS</w:t>
-      </w:r>
-    </w:p>
-    <w:p>
-      <w:r>
-        <w:drawing>
-          <wp:inline xmlns:a="http://schemas.openxmlformats.org/drawingml/2006/main" xmlns:pic="http://schemas.openxmlformats.org/drawingml/2006/picture">
-            <wp:extent cx="2286000" cy="5080000"/>
-            <wp:docPr id="5" name="Picture 5"/>
-            <wp:cNvGraphicFramePr>
-              <a:graphicFrameLocks noChangeAspect="1"/>
-            </wp:cNvGraphicFramePr>
-            <a:graphic>
-              <a:graphicData uri="http://schemas.openxmlformats.org/drawingml/2006/picture">
-                <pic:pic>
-                  <pic:nvPicPr>
-                    <pic:cNvPr id="0" name="e2e-android-04-counter-reset-pass.png"/>
-                    <pic:cNvPicPr/>
-                  </pic:nvPicPr>
-                  <pic:blipFill>
-                    <a:blip r:embed="rId13"/>
-                    <a:stretch>
-                      <a:fillRect/>
-                    </a:stretch>
-                  </pic:blipFill>
-                  <pic:spPr>
-                    <a:xfrm>
-                      <a:off x="0" y="0"/>
-                      <a:ext cx="2286000" cy="5080000"/>
-                    </a:xfrm>
-                    <a:prstGeom prst="rect"/>
-                  </pic:spPr>
-                </pic:pic>
-              </a:graphicData>
-            </a:graphic>
-          </wp:inline>
-        </w:drawing>
-      </w:r>
-    </w:p>
-    <w:p/>
-    <w:p>
-      <w:r>
-        <w:t>Test #5: Negative Counter — ✅ PASS</w:t>
-      </w:r>
-    </w:p>
-    <w:p>
-      <w:r>
-        <w:drawing>
-          <wp:inline xmlns:a="http://schemas.openxmlformats.org/drawingml/2006/main" xmlns:pic="http://schemas.openxmlformats.org/drawingml/2006/picture">
-            <wp:extent cx="2286000" cy="5080000"/>
-            <wp:docPr id="6" name="Picture 6"/>
-            <wp:cNvGraphicFramePr>
-              <a:graphicFrameLocks noChangeAspect="1"/>
-            </wp:cNvGraphicFramePr>
-            <a:graphic>
-              <a:graphicData uri="http://schemas.openxmlformats.org/drawingml/2006/picture">
-                <pic:pic>
-                  <pic:nvPicPr>
-                    <pic:cNvPr id="0" name="e2e-android-05-negative-counter-pass.png"/>
-                    <pic:cNvPicPr/>
-                  </pic:nvPicPr>
-                  <pic:blipFill>
-                    <a:blip r:embed="rId14"/>
-                    <a:stretch>
-                      <a:fillRect/>
-                    </a:stretch>
-                  </pic:blipFill>
-                  <pic:spPr>
-                    <a:xfrm>
-                      <a:off x="0" y="0"/>
-                      <a:ext cx="2286000" cy="5080000"/>
+                      <a:ext cx="3657600" cy="8128000"/>
                     </a:xfrm>
                     <a:prstGeom prst="rect"/>
                   </pic:spPr>
@@ -642,27 +884,1569 @@
         <w:pStyle w:val="Heading2"/>
       </w:pPr>
       <w:r>
-        <w:t>Findings &amp; Observations</w:t>
+        <w:t>Test 02: Greeting Flow</w:t>
+      </w:r>
+    </w:p>
+    <w:tbl>
+      <w:tblPr>
+        <w:tblStyle w:val="LightGrid-Accent1"/>
+        <w:tblW w:type="auto" w:w="0"/>
+        <w:tblLook w:firstColumn="1" w:firstRow="1" w:lastColumn="0" w:lastRow="0" w:noHBand="0" w:noVBand="1" w:val="04A0"/>
+      </w:tblPr>
+      <w:tblGrid>
+        <w:gridCol w:w="4320"/>
+        <w:gridCol w:w="4320"/>
+      </w:tblGrid>
+      <w:tr>
+        <w:tc>
+          <w:tcPr>
+            <w:tcW w:type="dxa" w:w="4320"/>
+          </w:tcPr>
+          <w:p>
+            <w:r>
+              <w:t>Script</w:t>
+            </w:r>
+          </w:p>
+        </w:tc>
+        <w:tc>
+          <w:tcPr>
+            <w:tcW w:type="dxa" w:w="4320"/>
+          </w:tcPr>
+          <w:p>
+            <w:r>
+              <w:t>02-greeting-flow.yaml</w:t>
+            </w:r>
+          </w:p>
+        </w:tc>
+      </w:tr>
+      <w:tr>
+        <w:tc>
+          <w:tcPr>
+            <w:tcW w:type="dxa" w:w="4320"/>
+          </w:tcPr>
+          <w:p>
+            <w:r>
+              <w:t>Expected</w:t>
+            </w:r>
+          </w:p>
+        </w:tc>
+        <w:tc>
+          <w:tcPr>
+            <w:tcW w:type="dxa" w:w="4320"/>
+          </w:tcPr>
+          <w:p>
+            <w:r>
+              <w:t>Greeting text "Hello, John!" appears after entering name and tapping button</w:t>
+            </w:r>
+          </w:p>
+        </w:tc>
+      </w:tr>
+      <w:tr>
+        <w:tc>
+          <w:tcPr>
+            <w:tcW w:type="dxa" w:w="4320"/>
+          </w:tcPr>
+          <w:p>
+            <w:r>
+              <w:t>Actual</w:t>
+            </w:r>
+          </w:p>
+        </w:tc>
+        <w:tc>
+          <w:tcPr>
+            <w:tcW w:type="dxa" w:w="4320"/>
+          </w:tcPr>
+          <w:p>
+            <w:r>
+              <w:t>"Hello, John!" displayed correctly</w:t>
+            </w:r>
+          </w:p>
+        </w:tc>
+      </w:tr>
+      <w:tr>
+        <w:tc>
+          <w:tcPr>
+            <w:tcW w:type="dxa" w:w="4320"/>
+          </w:tcPr>
+          <w:p>
+            <w:r>
+              <w:t>Status</w:t>
+            </w:r>
+          </w:p>
+        </w:tc>
+        <w:tc>
+          <w:tcPr>
+            <w:tcW w:type="dxa" w:w="4320"/>
+          </w:tcPr>
+          <w:p>
+            <w:r>
+              <w:t>PASS</w:t>
+            </w:r>
+          </w:p>
+        </w:tc>
+      </w:tr>
+    </w:tbl>
+    <w:p/>
+    <w:p>
+      <w:pPr>
+        <w:pStyle w:val="Caption"/>
+      </w:pPr>
+      <w:r>
+        <w:t>Screenshot: e2e-android-02-greeting-flow-pass.png</w:t>
+      </w:r>
+    </w:p>
+    <w:p>
+      <w:pPr>
+        <w:jc w:val="center"/>
+      </w:pPr>
+      <w:r>
+        <w:drawing>
+          <wp:inline xmlns:a="http://schemas.openxmlformats.org/drawingml/2006/main" xmlns:pic="http://schemas.openxmlformats.org/drawingml/2006/picture">
+            <wp:extent cx="3657600" cy="8128000"/>
+            <wp:docPr id="2" name="Picture 2"/>
+            <wp:cNvGraphicFramePr>
+              <a:graphicFrameLocks noChangeAspect="1"/>
+            </wp:cNvGraphicFramePr>
+            <a:graphic>
+              <a:graphicData uri="http://schemas.openxmlformats.org/drawingml/2006/picture">
+                <pic:pic>
+                  <pic:nvPicPr>
+                    <pic:cNvPr id="0" name="e2e-android-02-greeting-flow-pass.png"/>
+                    <pic:cNvPicPr/>
+                  </pic:nvPicPr>
+                  <pic:blipFill>
+                    <a:blip r:embed="rId10"/>
+                    <a:stretch>
+                      <a:fillRect/>
+                    </a:stretch>
+                  </pic:blipFill>
+                  <pic:spPr>
+                    <a:xfrm>
+                      <a:off x="0" y="0"/>
+                      <a:ext cx="3657600" cy="8128000"/>
+                    </a:xfrm>
+                    <a:prstGeom prst="rect"/>
+                  </pic:spPr>
+                </pic:pic>
+              </a:graphicData>
+            </a:graphic>
+          </wp:inline>
+        </w:drawing>
+      </w:r>
+    </w:p>
+    <w:p/>
+    <w:p>
+      <w:pPr>
+        <w:pStyle w:val="Heading2"/>
+      </w:pPr>
+      <w:r>
+        <w:t>Test 03: Greeting Empty Name</w:t>
+      </w:r>
+    </w:p>
+    <w:tbl>
+      <w:tblPr>
+        <w:tblStyle w:val="LightGrid-Accent1"/>
+        <w:tblW w:type="auto" w:w="0"/>
+        <w:tblLook w:firstColumn="1" w:firstRow="1" w:lastColumn="0" w:lastRow="0" w:noHBand="0" w:noVBand="1" w:val="04A0"/>
+      </w:tblPr>
+      <w:tblGrid>
+        <w:gridCol w:w="4320"/>
+        <w:gridCol w:w="4320"/>
+      </w:tblGrid>
+      <w:tr>
+        <w:tc>
+          <w:tcPr>
+            <w:tcW w:type="dxa" w:w="4320"/>
+          </w:tcPr>
+          <w:p>
+            <w:r>
+              <w:t>Script</w:t>
+            </w:r>
+          </w:p>
+        </w:tc>
+        <w:tc>
+          <w:tcPr>
+            <w:tcW w:type="dxa" w:w="4320"/>
+          </w:tcPr>
+          <w:p>
+            <w:r>
+              <w:t>03-greeting-empty-name.yaml</w:t>
+            </w:r>
+          </w:p>
+        </w:tc>
+      </w:tr>
+      <w:tr>
+        <w:tc>
+          <w:tcPr>
+            <w:tcW w:type="dxa" w:w="4320"/>
+          </w:tcPr>
+          <w:p>
+            <w:r>
+              <w:t>Expected</w:t>
+            </w:r>
+          </w:p>
+        </w:tc>
+        <w:tc>
+          <w:tcPr>
+            <w:tcW w:type="dxa" w:w="4320"/>
+          </w:tcPr>
+          <w:p>
+            <w:r>
+              <w:t>Greeting displays "Hello, !" when no name is entered</w:t>
+            </w:r>
+          </w:p>
+        </w:tc>
+      </w:tr>
+      <w:tr>
+        <w:tc>
+          <w:tcPr>
+            <w:tcW w:type="dxa" w:w="4320"/>
+          </w:tcPr>
+          <w:p>
+            <w:r>
+              <w:t>Actual</w:t>
+            </w:r>
+          </w:p>
+        </w:tc>
+        <w:tc>
+          <w:tcPr>
+            <w:tcW w:type="dxa" w:w="4320"/>
+          </w:tcPr>
+          <w:p>
+            <w:r>
+              <w:t>"Hello, !" displayed correctly</w:t>
+            </w:r>
+          </w:p>
+        </w:tc>
+      </w:tr>
+      <w:tr>
+        <w:tc>
+          <w:tcPr>
+            <w:tcW w:type="dxa" w:w="4320"/>
+          </w:tcPr>
+          <w:p>
+            <w:r>
+              <w:t>Status</w:t>
+            </w:r>
+          </w:p>
+        </w:tc>
+        <w:tc>
+          <w:tcPr>
+            <w:tcW w:type="dxa" w:w="4320"/>
+          </w:tcPr>
+          <w:p>
+            <w:r>
+              <w:t>PASS</w:t>
+            </w:r>
+          </w:p>
+        </w:tc>
+      </w:tr>
+    </w:tbl>
+    <w:p/>
+    <w:p>
+      <w:pPr>
+        <w:pStyle w:val="Caption"/>
+      </w:pPr>
+      <w:r>
+        <w:t>Screenshot: e2e-android-03-greeting-empty-name-pass.png</w:t>
+      </w:r>
+    </w:p>
+    <w:p>
+      <w:pPr>
+        <w:jc w:val="center"/>
+      </w:pPr>
+      <w:r>
+        <w:drawing>
+          <wp:inline xmlns:a="http://schemas.openxmlformats.org/drawingml/2006/main" xmlns:pic="http://schemas.openxmlformats.org/drawingml/2006/picture">
+            <wp:extent cx="3657600" cy="8128000"/>
+            <wp:docPr id="3" name="Picture 3"/>
+            <wp:cNvGraphicFramePr>
+              <a:graphicFrameLocks noChangeAspect="1"/>
+            </wp:cNvGraphicFramePr>
+            <a:graphic>
+              <a:graphicData uri="http://schemas.openxmlformats.org/drawingml/2006/picture">
+                <pic:pic>
+                  <pic:nvPicPr>
+                    <pic:cNvPr id="0" name="e2e-android-03-greeting-empty-name-pass.png"/>
+                    <pic:cNvPicPr/>
+                  </pic:nvPicPr>
+                  <pic:blipFill>
+                    <a:blip r:embed="rId11"/>
+                    <a:stretch>
+                      <a:fillRect/>
+                    </a:stretch>
+                  </pic:blipFill>
+                  <pic:spPr>
+                    <a:xfrm>
+                      <a:off x="0" y="0"/>
+                      <a:ext cx="3657600" cy="8128000"/>
+                    </a:xfrm>
+                    <a:prstGeom prst="rect"/>
+                  </pic:spPr>
+                </pic:pic>
+              </a:graphicData>
+            </a:graphic>
+          </wp:inline>
+        </w:drawing>
+      </w:r>
+    </w:p>
+    <w:p/>
+    <w:p>
+      <w:pPr>
+        <w:pStyle w:val="Heading2"/>
+      </w:pPr>
+      <w:r>
+        <w:t>Test 04: Counter Increment</w:t>
+      </w:r>
+    </w:p>
+    <w:tbl>
+      <w:tblPr>
+        <w:tblStyle w:val="LightGrid-Accent1"/>
+        <w:tblW w:type="auto" w:w="0"/>
+        <w:tblLook w:firstColumn="1" w:firstRow="1" w:lastColumn="0" w:lastRow="0" w:noHBand="0" w:noVBand="1" w:val="04A0"/>
+      </w:tblPr>
+      <w:tblGrid>
+        <w:gridCol w:w="4320"/>
+        <w:gridCol w:w="4320"/>
+      </w:tblGrid>
+      <w:tr>
+        <w:tc>
+          <w:tcPr>
+            <w:tcW w:type="dxa" w:w="4320"/>
+          </w:tcPr>
+          <w:p>
+            <w:r>
+              <w:t>Script</w:t>
+            </w:r>
+          </w:p>
+        </w:tc>
+        <w:tc>
+          <w:tcPr>
+            <w:tcW w:type="dxa" w:w="4320"/>
+          </w:tcPr>
+          <w:p>
+            <w:r>
+              <w:t>04-counter-increment.yaml</w:t>
+            </w:r>
+          </w:p>
+        </w:tc>
+      </w:tr>
+      <w:tr>
+        <w:tc>
+          <w:tcPr>
+            <w:tcW w:type="dxa" w:w="4320"/>
+          </w:tcPr>
+          <w:p>
+            <w:r>
+              <w:t>Expected</w:t>
+            </w:r>
+          </w:p>
+        </w:tc>
+        <w:tc>
+          <w:tcPr>
+            <w:tcW w:type="dxa" w:w="4320"/>
+          </w:tcPr>
+          <w:p>
+            <w:r>
+              <w:t>Counter increments correctly with each +1 tap</w:t>
+            </w:r>
+          </w:p>
+        </w:tc>
+      </w:tr>
+      <w:tr>
+        <w:tc>
+          <w:tcPr>
+            <w:tcW w:type="dxa" w:w="4320"/>
+          </w:tcPr>
+          <w:p>
+            <w:r>
+              <w:t>Actual</w:t>
+            </w:r>
+          </w:p>
+        </w:tc>
+        <w:tc>
+          <w:tcPr>
+            <w:tcW w:type="dxa" w:w="4320"/>
+          </w:tcPr>
+          <w:p>
+            <w:r>
+              <w:t>Counter went 0 -&gt; 1 -&gt; 3 correctly</w:t>
+            </w:r>
+          </w:p>
+        </w:tc>
+      </w:tr>
+      <w:tr>
+        <w:tc>
+          <w:tcPr>
+            <w:tcW w:type="dxa" w:w="4320"/>
+          </w:tcPr>
+          <w:p>
+            <w:r>
+              <w:t>Status</w:t>
+            </w:r>
+          </w:p>
+        </w:tc>
+        <w:tc>
+          <w:tcPr>
+            <w:tcW w:type="dxa" w:w="4320"/>
+          </w:tcPr>
+          <w:p>
+            <w:r>
+              <w:t>PASS</w:t>
+            </w:r>
+          </w:p>
+        </w:tc>
+      </w:tr>
+    </w:tbl>
+    <w:p/>
+    <w:p>
+      <w:pPr>
+        <w:pStyle w:val="Caption"/>
+      </w:pPr>
+      <w:r>
+        <w:t>Screenshot: e2e-android-04-counter-increment-pass.png</w:t>
+      </w:r>
+    </w:p>
+    <w:p>
+      <w:pPr>
+        <w:jc w:val="center"/>
+      </w:pPr>
+      <w:r>
+        <w:drawing>
+          <wp:inline xmlns:a="http://schemas.openxmlformats.org/drawingml/2006/main" xmlns:pic="http://schemas.openxmlformats.org/drawingml/2006/picture">
+            <wp:extent cx="3657600" cy="8128000"/>
+            <wp:docPr id="4" name="Picture 4"/>
+            <wp:cNvGraphicFramePr>
+              <a:graphicFrameLocks noChangeAspect="1"/>
+            </wp:cNvGraphicFramePr>
+            <a:graphic>
+              <a:graphicData uri="http://schemas.openxmlformats.org/drawingml/2006/picture">
+                <pic:pic>
+                  <pic:nvPicPr>
+                    <pic:cNvPr id="0" name="e2e-android-04-counter-increment-pass.png"/>
+                    <pic:cNvPicPr/>
+                  </pic:nvPicPr>
+                  <pic:blipFill>
+                    <a:blip r:embed="rId12"/>
+                    <a:stretch>
+                      <a:fillRect/>
+                    </a:stretch>
+                  </pic:blipFill>
+                  <pic:spPr>
+                    <a:xfrm>
+                      <a:off x="0" y="0"/>
+                      <a:ext cx="3657600" cy="8128000"/>
+                    </a:xfrm>
+                    <a:prstGeom prst="rect"/>
+                  </pic:spPr>
+                </pic:pic>
+              </a:graphicData>
+            </a:graphic>
+          </wp:inline>
+        </w:drawing>
+      </w:r>
+    </w:p>
+    <w:p/>
+    <w:p>
+      <w:pPr>
+        <w:pStyle w:val="Heading2"/>
+      </w:pPr>
+      <w:r>
+        <w:t>Test 05: Counter Decrement</w:t>
+      </w:r>
+    </w:p>
+    <w:tbl>
+      <w:tblPr>
+        <w:tblStyle w:val="LightGrid-Accent1"/>
+        <w:tblW w:type="auto" w:w="0"/>
+        <w:tblLook w:firstColumn="1" w:firstRow="1" w:lastColumn="0" w:lastRow="0" w:noHBand="0" w:noVBand="1" w:val="04A0"/>
+      </w:tblPr>
+      <w:tblGrid>
+        <w:gridCol w:w="4320"/>
+        <w:gridCol w:w="4320"/>
+      </w:tblGrid>
+      <w:tr>
+        <w:tc>
+          <w:tcPr>
+            <w:tcW w:type="dxa" w:w="4320"/>
+          </w:tcPr>
+          <w:p>
+            <w:r>
+              <w:t>Script</w:t>
+            </w:r>
+          </w:p>
+        </w:tc>
+        <w:tc>
+          <w:tcPr>
+            <w:tcW w:type="dxa" w:w="4320"/>
+          </w:tcPr>
+          <w:p>
+            <w:r>
+              <w:t>05-counter-decrement.yaml</w:t>
+            </w:r>
+          </w:p>
+        </w:tc>
+      </w:tr>
+      <w:tr>
+        <w:tc>
+          <w:tcPr>
+            <w:tcW w:type="dxa" w:w="4320"/>
+          </w:tcPr>
+          <w:p>
+            <w:r>
+              <w:t>Expected</w:t>
+            </w:r>
+          </w:p>
+        </w:tc>
+        <w:tc>
+          <w:tcPr>
+            <w:tcW w:type="dxa" w:w="4320"/>
+          </w:tcPr>
+          <w:p>
+            <w:r>
+              <w:t>Counter decrements correctly and supports negative values</w:t>
+            </w:r>
+          </w:p>
+        </w:tc>
+      </w:tr>
+      <w:tr>
+        <w:tc>
+          <w:tcPr>
+            <w:tcW w:type="dxa" w:w="4320"/>
+          </w:tcPr>
+          <w:p>
+            <w:r>
+              <w:t>Actual</w:t>
+            </w:r>
+          </w:p>
+        </w:tc>
+        <w:tc>
+          <w:tcPr>
+            <w:tcW w:type="dxa" w:w="4320"/>
+          </w:tcPr>
+          <w:p>
+            <w:r>
+              <w:t>Counter went 0 -&gt; -1 -&gt; -2 correctly</w:t>
+            </w:r>
+          </w:p>
+        </w:tc>
+      </w:tr>
+      <w:tr>
+        <w:tc>
+          <w:tcPr>
+            <w:tcW w:type="dxa" w:w="4320"/>
+          </w:tcPr>
+          <w:p>
+            <w:r>
+              <w:t>Status</w:t>
+            </w:r>
+          </w:p>
+        </w:tc>
+        <w:tc>
+          <w:tcPr>
+            <w:tcW w:type="dxa" w:w="4320"/>
+          </w:tcPr>
+          <w:p>
+            <w:r>
+              <w:t>PASS</w:t>
+            </w:r>
+          </w:p>
+        </w:tc>
+      </w:tr>
+    </w:tbl>
+    <w:p/>
+    <w:p>
+      <w:pPr>
+        <w:pStyle w:val="Caption"/>
+      </w:pPr>
+      <w:r>
+        <w:t>Screenshot: e2e-android-05-counter-decrement-pass.png</w:t>
+      </w:r>
+    </w:p>
+    <w:p>
+      <w:pPr>
+        <w:jc w:val="center"/>
+      </w:pPr>
+      <w:r>
+        <w:drawing>
+          <wp:inline xmlns:a="http://schemas.openxmlformats.org/drawingml/2006/main" xmlns:pic="http://schemas.openxmlformats.org/drawingml/2006/picture">
+            <wp:extent cx="3657600" cy="8128000"/>
+            <wp:docPr id="5" name="Picture 5"/>
+            <wp:cNvGraphicFramePr>
+              <a:graphicFrameLocks noChangeAspect="1"/>
+            </wp:cNvGraphicFramePr>
+            <a:graphic>
+              <a:graphicData uri="http://schemas.openxmlformats.org/drawingml/2006/picture">
+                <pic:pic>
+                  <pic:nvPicPr>
+                    <pic:cNvPr id="0" name="e2e-android-05-counter-decrement-pass.png"/>
+                    <pic:cNvPicPr/>
+                  </pic:nvPicPr>
+                  <pic:blipFill>
+                    <a:blip r:embed="rId13"/>
+                    <a:stretch>
+                      <a:fillRect/>
+                    </a:stretch>
+                  </pic:blipFill>
+                  <pic:spPr>
+                    <a:xfrm>
+                      <a:off x="0" y="0"/>
+                      <a:ext cx="3657600" cy="8128000"/>
+                    </a:xfrm>
+                    <a:prstGeom prst="rect"/>
+                  </pic:spPr>
+                </pic:pic>
+              </a:graphicData>
+            </a:graphic>
+          </wp:inline>
+        </w:drawing>
+      </w:r>
+    </w:p>
+    <w:p/>
+    <w:p>
+      <w:pPr>
+        <w:pStyle w:val="Heading2"/>
+      </w:pPr>
+      <w:r>
+        <w:t>Test 06: Counter Reset</w:t>
+      </w:r>
+    </w:p>
+    <w:tbl>
+      <w:tblPr>
+        <w:tblStyle w:val="LightGrid-Accent1"/>
+        <w:tblW w:type="auto" w:w="0"/>
+        <w:tblLook w:firstColumn="1" w:firstRow="1" w:lastColumn="0" w:lastRow="0" w:noHBand="0" w:noVBand="1" w:val="04A0"/>
+      </w:tblPr>
+      <w:tblGrid>
+        <w:gridCol w:w="4320"/>
+        <w:gridCol w:w="4320"/>
+      </w:tblGrid>
+      <w:tr>
+        <w:tc>
+          <w:tcPr>
+            <w:tcW w:type="dxa" w:w="4320"/>
+          </w:tcPr>
+          <w:p>
+            <w:r>
+              <w:t>Script</w:t>
+            </w:r>
+          </w:p>
+        </w:tc>
+        <w:tc>
+          <w:tcPr>
+            <w:tcW w:type="dxa" w:w="4320"/>
+          </w:tcPr>
+          <w:p>
+            <w:r>
+              <w:t>06-counter-reset.yaml</w:t>
+            </w:r>
+          </w:p>
+        </w:tc>
+      </w:tr>
+      <w:tr>
+        <w:tc>
+          <w:tcPr>
+            <w:tcW w:type="dxa" w:w="4320"/>
+          </w:tcPr>
+          <w:p>
+            <w:r>
+              <w:t>Expected</w:t>
+            </w:r>
+          </w:p>
+        </w:tc>
+        <w:tc>
+          <w:tcPr>
+            <w:tcW w:type="dxa" w:w="4320"/>
+          </w:tcPr>
+          <w:p>
+            <w:r>
+              <w:t>Counter resets to 0 regardless of current value</w:t>
+            </w:r>
+          </w:p>
+        </w:tc>
+      </w:tr>
+      <w:tr>
+        <w:tc>
+          <w:tcPr>
+            <w:tcW w:type="dxa" w:w="4320"/>
+          </w:tcPr>
+          <w:p>
+            <w:r>
+              <w:t>Actual</w:t>
+            </w:r>
+          </w:p>
+        </w:tc>
+        <w:tc>
+          <w:tcPr>
+            <w:tcW w:type="dxa" w:w="4320"/>
+          </w:tcPr>
+          <w:p>
+            <w:r>
+              <w:t>Counter reset from 3 to 0 correctly</w:t>
+            </w:r>
+          </w:p>
+        </w:tc>
+      </w:tr>
+      <w:tr>
+        <w:tc>
+          <w:tcPr>
+            <w:tcW w:type="dxa" w:w="4320"/>
+          </w:tcPr>
+          <w:p>
+            <w:r>
+              <w:t>Status</w:t>
+            </w:r>
+          </w:p>
+        </w:tc>
+        <w:tc>
+          <w:tcPr>
+            <w:tcW w:type="dxa" w:w="4320"/>
+          </w:tcPr>
+          <w:p>
+            <w:r>
+              <w:t>PASS</w:t>
+            </w:r>
+          </w:p>
+        </w:tc>
+      </w:tr>
+    </w:tbl>
+    <w:p/>
+    <w:p>
+      <w:pPr>
+        <w:pStyle w:val="Caption"/>
+      </w:pPr>
+      <w:r>
+        <w:t>Screenshot: e2e-android-06-counter-reset-pass.png</w:t>
+      </w:r>
+    </w:p>
+    <w:p>
+      <w:pPr>
+        <w:jc w:val="center"/>
+      </w:pPr>
+      <w:r>
+        <w:drawing>
+          <wp:inline xmlns:a="http://schemas.openxmlformats.org/drawingml/2006/main" xmlns:pic="http://schemas.openxmlformats.org/drawingml/2006/picture">
+            <wp:extent cx="3657600" cy="8128000"/>
+            <wp:docPr id="6" name="Picture 6"/>
+            <wp:cNvGraphicFramePr>
+              <a:graphicFrameLocks noChangeAspect="1"/>
+            </wp:cNvGraphicFramePr>
+            <a:graphic>
+              <a:graphicData uri="http://schemas.openxmlformats.org/drawingml/2006/picture">
+                <pic:pic>
+                  <pic:nvPicPr>
+                    <pic:cNvPr id="0" name="e2e-android-06-counter-reset-pass.png"/>
+                    <pic:cNvPicPr/>
+                  </pic:nvPicPr>
+                  <pic:blipFill>
+                    <a:blip r:embed="rId14"/>
+                    <a:stretch>
+                      <a:fillRect/>
+                    </a:stretch>
+                  </pic:blipFill>
+                  <pic:spPr>
+                    <a:xfrm>
+                      <a:off x="0" y="0"/>
+                      <a:ext cx="3657600" cy="8128000"/>
+                    </a:xfrm>
+                    <a:prstGeom prst="rect"/>
+                  </pic:spPr>
+                </pic:pic>
+              </a:graphicData>
+            </a:graphic>
+          </wp:inline>
+        </w:drawing>
+      </w:r>
+    </w:p>
+    <w:p/>
+    <w:p>
+      <w:pPr>
+        <w:pStyle w:val="Heading2"/>
+      </w:pPr>
+      <w:r>
+        <w:t>Test 07: Greeting Special Characters</w:t>
+      </w:r>
+    </w:p>
+    <w:tbl>
+      <w:tblPr>
+        <w:tblStyle w:val="LightGrid-Accent1"/>
+        <w:tblW w:type="auto" w:w="0"/>
+        <w:tblLook w:firstColumn="1" w:firstRow="1" w:lastColumn="0" w:lastRow="0" w:noHBand="0" w:noVBand="1" w:val="04A0"/>
+      </w:tblPr>
+      <w:tblGrid>
+        <w:gridCol w:w="4320"/>
+        <w:gridCol w:w="4320"/>
+      </w:tblGrid>
+      <w:tr>
+        <w:tc>
+          <w:tcPr>
+            <w:tcW w:type="dxa" w:w="4320"/>
+          </w:tcPr>
+          <w:p>
+            <w:r>
+              <w:t>Script</w:t>
+            </w:r>
+          </w:p>
+        </w:tc>
+        <w:tc>
+          <w:tcPr>
+            <w:tcW w:type="dxa" w:w="4320"/>
+          </w:tcPr>
+          <w:p>
+            <w:r>
+              <w:t>07-greeting-special-characters.yaml</w:t>
+            </w:r>
+          </w:p>
+        </w:tc>
+      </w:tr>
+      <w:tr>
+        <w:tc>
+          <w:tcPr>
+            <w:tcW w:type="dxa" w:w="4320"/>
+          </w:tcPr>
+          <w:p>
+            <w:r>
+              <w:t>Expected</w:t>
+            </w:r>
+          </w:p>
+        </w:tc>
+        <w:tc>
+          <w:tcPr>
+            <w:tcW w:type="dxa" w:w="4320"/>
+          </w:tcPr>
+          <w:p>
+            <w:r>
+              <w:t>Greeting correctly displays names with special characters</w:t>
+            </w:r>
+          </w:p>
+        </w:tc>
+      </w:tr>
+      <w:tr>
+        <w:tc>
+          <w:tcPr>
+            <w:tcW w:type="dxa" w:w="4320"/>
+          </w:tcPr>
+          <w:p>
+            <w:r>
+              <w:t>Actual</w:t>
+            </w:r>
+          </w:p>
+        </w:tc>
+        <w:tc>
+          <w:tcPr>
+            <w:tcW w:type="dxa" w:w="4320"/>
+          </w:tcPr>
+          <w:p>
+            <w:r>
+              <w:t>"Hello, O'Brien!" displayed correctly</w:t>
+            </w:r>
+          </w:p>
+        </w:tc>
+      </w:tr>
+      <w:tr>
+        <w:tc>
+          <w:tcPr>
+            <w:tcW w:type="dxa" w:w="4320"/>
+          </w:tcPr>
+          <w:p>
+            <w:r>
+              <w:t>Status</w:t>
+            </w:r>
+          </w:p>
+        </w:tc>
+        <w:tc>
+          <w:tcPr>
+            <w:tcW w:type="dxa" w:w="4320"/>
+          </w:tcPr>
+          <w:p>
+            <w:r>
+              <w:t>PASS</w:t>
+            </w:r>
+          </w:p>
+        </w:tc>
+      </w:tr>
+    </w:tbl>
+    <w:p/>
+    <w:p>
+      <w:pPr>
+        <w:pStyle w:val="Caption"/>
+      </w:pPr>
+      <w:r>
+        <w:t>Screenshot: e2e-android-07-greeting-special-characters-pass.png</w:t>
+      </w:r>
+    </w:p>
+    <w:p>
+      <w:pPr>
+        <w:jc w:val="center"/>
+      </w:pPr>
+      <w:r>
+        <w:drawing>
+          <wp:inline xmlns:a="http://schemas.openxmlformats.org/drawingml/2006/main" xmlns:pic="http://schemas.openxmlformats.org/drawingml/2006/picture">
+            <wp:extent cx="3657600" cy="8128000"/>
+            <wp:docPr id="7" name="Picture 7"/>
+            <wp:cNvGraphicFramePr>
+              <a:graphicFrameLocks noChangeAspect="1"/>
+            </wp:cNvGraphicFramePr>
+            <a:graphic>
+              <a:graphicData uri="http://schemas.openxmlformats.org/drawingml/2006/picture">
+                <pic:pic>
+                  <pic:nvPicPr>
+                    <pic:cNvPr id="0" name="e2e-android-07-greeting-special-characters-pass.png"/>
+                    <pic:cNvPicPr/>
+                  </pic:nvPicPr>
+                  <pic:blipFill>
+                    <a:blip r:embed="rId15"/>
+                    <a:stretch>
+                      <a:fillRect/>
+                    </a:stretch>
+                  </pic:blipFill>
+                  <pic:spPr>
+                    <a:xfrm>
+                      <a:off x="0" y="0"/>
+                      <a:ext cx="3657600" cy="8128000"/>
+                    </a:xfrm>
+                    <a:prstGeom prst="rect"/>
+                  </pic:spPr>
+                </pic:pic>
+              </a:graphicData>
+            </a:graphic>
+          </wp:inline>
+        </w:drawing>
+      </w:r>
+    </w:p>
+    <w:p/>
+    <w:p>
+      <w:pPr>
+        <w:pStyle w:val="Heading2"/>
+      </w:pPr>
+      <w:r>
+        <w:t>Test 08: Counter Mixed Operations</w:t>
+      </w:r>
+    </w:p>
+    <w:tbl>
+      <w:tblPr>
+        <w:tblStyle w:val="LightGrid-Accent1"/>
+        <w:tblW w:type="auto" w:w="0"/>
+        <w:tblLook w:firstColumn="1" w:firstRow="1" w:lastColumn="0" w:lastRow="0" w:noHBand="0" w:noVBand="1" w:val="04A0"/>
+      </w:tblPr>
+      <w:tblGrid>
+        <w:gridCol w:w="4320"/>
+        <w:gridCol w:w="4320"/>
+      </w:tblGrid>
+      <w:tr>
+        <w:tc>
+          <w:tcPr>
+            <w:tcW w:type="dxa" w:w="4320"/>
+          </w:tcPr>
+          <w:p>
+            <w:r>
+              <w:t>Script</w:t>
+            </w:r>
+          </w:p>
+        </w:tc>
+        <w:tc>
+          <w:tcPr>
+            <w:tcW w:type="dxa" w:w="4320"/>
+          </w:tcPr>
+          <w:p>
+            <w:r>
+              <w:t>08-counter-mixed-operations.yaml</w:t>
+            </w:r>
+          </w:p>
+        </w:tc>
+      </w:tr>
+      <w:tr>
+        <w:tc>
+          <w:tcPr>
+            <w:tcW w:type="dxa" w:w="4320"/>
+          </w:tcPr>
+          <w:p>
+            <w:r>
+              <w:t>Expected</w:t>
+            </w:r>
+          </w:p>
+        </w:tc>
+        <w:tc>
+          <w:tcPr>
+            <w:tcW w:type="dxa" w:w="4320"/>
+          </w:tcPr>
+          <w:p>
+            <w:r>
+              <w:t>Counter correctly handles mix of increment, decrement, and reset</w:t>
+            </w:r>
+          </w:p>
+        </w:tc>
+      </w:tr>
+      <w:tr>
+        <w:tc>
+          <w:tcPr>
+            <w:tcW w:type="dxa" w:w="4320"/>
+          </w:tcPr>
+          <w:p>
+            <w:r>
+              <w:t>Actual</w:t>
+            </w:r>
+          </w:p>
+        </w:tc>
+        <w:tc>
+          <w:tcPr>
+            <w:tcW w:type="dxa" w:w="4320"/>
+          </w:tcPr>
+          <w:p>
+            <w:r>
+              <w:t>Counter: 3 increments, 2 decrements = 1, then reset to 0</w:t>
+            </w:r>
+          </w:p>
+        </w:tc>
+      </w:tr>
+      <w:tr>
+        <w:tc>
+          <w:tcPr>
+            <w:tcW w:type="dxa" w:w="4320"/>
+          </w:tcPr>
+          <w:p>
+            <w:r>
+              <w:t>Status</w:t>
+            </w:r>
+          </w:p>
+        </w:tc>
+        <w:tc>
+          <w:tcPr>
+            <w:tcW w:type="dxa" w:w="4320"/>
+          </w:tcPr>
+          <w:p>
+            <w:r>
+              <w:t>PASS</w:t>
+            </w:r>
+          </w:p>
+        </w:tc>
+      </w:tr>
+    </w:tbl>
+    <w:p/>
+    <w:p>
+      <w:pPr>
+        <w:pStyle w:val="Caption"/>
+      </w:pPr>
+      <w:r>
+        <w:t>Screenshot: e2e-android-08-counter-mixed-operations-pass.png</w:t>
+      </w:r>
+    </w:p>
+    <w:p>
+      <w:pPr>
+        <w:jc w:val="center"/>
+      </w:pPr>
+      <w:r>
+        <w:drawing>
+          <wp:inline xmlns:a="http://schemas.openxmlformats.org/drawingml/2006/main" xmlns:pic="http://schemas.openxmlformats.org/drawingml/2006/picture">
+            <wp:extent cx="3657600" cy="8128000"/>
+            <wp:docPr id="8" name="Picture 8"/>
+            <wp:cNvGraphicFramePr>
+              <a:graphicFrameLocks noChangeAspect="1"/>
+            </wp:cNvGraphicFramePr>
+            <a:graphic>
+              <a:graphicData uri="http://schemas.openxmlformats.org/drawingml/2006/picture">
+                <pic:pic>
+                  <pic:nvPicPr>
+                    <pic:cNvPr id="0" name="e2e-android-08-counter-mixed-operations-pass.png"/>
+                    <pic:cNvPicPr/>
+                  </pic:nvPicPr>
+                  <pic:blipFill>
+                    <a:blip r:embed="rId16"/>
+                    <a:stretch>
+                      <a:fillRect/>
+                    </a:stretch>
+                  </pic:blipFill>
+                  <pic:spPr>
+                    <a:xfrm>
+                      <a:off x="0" y="0"/>
+                      <a:ext cx="3657600" cy="8128000"/>
+                    </a:xfrm>
+                    <a:prstGeom prst="rect"/>
+                  </pic:spPr>
+                </pic:pic>
+              </a:graphicData>
+            </a:graphic>
+          </wp:inline>
+        </w:drawing>
+      </w:r>
+    </w:p>
+    <w:p>
+      <w:pPr>
+        <w:pStyle w:val="Caption"/>
+      </w:pPr>
+      <w:r>
+        <w:t>Screenshot: e2e-android-08-counter-mixed-reset-pass.png</w:t>
+      </w:r>
+    </w:p>
+    <w:p>
+      <w:pPr>
+        <w:jc w:val="center"/>
+      </w:pPr>
+      <w:r>
+        <w:drawing>
+          <wp:inline xmlns:a="http://schemas.openxmlformats.org/drawingml/2006/main" xmlns:pic="http://schemas.openxmlformats.org/drawingml/2006/picture">
+            <wp:extent cx="3657600" cy="8128000"/>
+            <wp:docPr id="9" name="Picture 9"/>
+            <wp:cNvGraphicFramePr>
+              <a:graphicFrameLocks noChangeAspect="1"/>
+            </wp:cNvGraphicFramePr>
+            <a:graphic>
+              <a:graphicData uri="http://schemas.openxmlformats.org/drawingml/2006/picture">
+                <pic:pic>
+                  <pic:nvPicPr>
+                    <pic:cNvPr id="0" name="e2e-android-08-counter-mixed-reset-pass.png"/>
+                    <pic:cNvPicPr/>
+                  </pic:nvPicPr>
+                  <pic:blipFill>
+                    <a:blip r:embed="rId17"/>
+                    <a:stretch>
+                      <a:fillRect/>
+                    </a:stretch>
+                  </pic:blipFill>
+                  <pic:spPr>
+                    <a:xfrm>
+                      <a:off x="0" y="0"/>
+                      <a:ext cx="3657600" cy="8128000"/>
+                    </a:xfrm>
+                    <a:prstGeom prst="rect"/>
+                  </pic:spPr>
+                </pic:pic>
+              </a:graphicData>
+            </a:graphic>
+          </wp:inline>
+        </w:drawing>
+      </w:r>
+    </w:p>
+    <w:p/>
+    <w:p>
+      <w:pPr>
+        <w:pStyle w:val="Heading1"/>
+      </w:pPr>
+      <w:r>
+        <w:t>Coverage Metrics</w:t>
       </w:r>
     </w:p>
     <w:p>
       <w:r>
-        <w:t>1. All core functionality works correctly — greeting and counter features behave as coded.</w:t>
+        <w:t>Source: e2e-tests/coverage.yaml</w:t>
+      </w:r>
+    </w:p>
+    <w:p/>
+    <w:tbl>
+      <w:tblPr>
+        <w:tblStyle w:val="LightGrid-Accent1"/>
+        <w:tblW w:type="auto" w:w="0"/>
+        <w:tblLook w:firstColumn="1" w:firstRow="1" w:lastColumn="0" w:lastRow="0" w:noHBand="0" w:noVBand="1" w:val="04A0"/>
+      </w:tblPr>
+      <w:tblGrid>
+        <w:gridCol w:w="4320"/>
+        <w:gridCol w:w="4320"/>
+      </w:tblGrid>
+      <w:tr>
+        <w:tc>
+          <w:tcPr>
+            <w:tcW w:type="dxa" w:w="4320"/>
+          </w:tcPr>
+          <w:p>
+            <w:r>
+              <w:t>Total Screens</w:t>
+            </w:r>
+          </w:p>
+        </w:tc>
+        <w:tc>
+          <w:tcPr>
+            <w:tcW w:type="dxa" w:w="4320"/>
+          </w:tcPr>
+          <w:p>
+            <w:r>
+              <w:t>1</w:t>
+            </w:r>
+          </w:p>
+        </w:tc>
+      </w:tr>
+      <w:tr>
+        <w:tc>
+          <w:tcPr>
+            <w:tcW w:type="dxa" w:w="4320"/>
+          </w:tcPr>
+          <w:p>
+            <w:r>
+              <w:t>Total UI Elements</w:t>
+            </w:r>
+          </w:p>
+        </w:tc>
+        <w:tc>
+          <w:tcPr>
+            <w:tcW w:type="dxa" w:w="4320"/>
+          </w:tcPr>
+          <w:p>
+            <w:r>
+              <w:t>8</w:t>
+            </w:r>
+          </w:p>
+        </w:tc>
+      </w:tr>
+      <w:tr>
+        <w:tc>
+          <w:tcPr>
+            <w:tcW w:type="dxa" w:w="4320"/>
+          </w:tcPr>
+          <w:p>
+            <w:r>
+              <w:t>Covered Elements</w:t>
+            </w:r>
+          </w:p>
+        </w:tc>
+        <w:tc>
+          <w:tcPr>
+            <w:tcW w:type="dxa" w:w="4320"/>
+          </w:tcPr>
+          <w:p>
+            <w:r>
+              <w:t>8</w:t>
+            </w:r>
+          </w:p>
+        </w:tc>
+      </w:tr>
+      <w:tr>
+        <w:tc>
+          <w:tcPr>
+            <w:tcW w:type="dxa" w:w="4320"/>
+          </w:tcPr>
+          <w:p>
+            <w:r>
+              <w:t>Uncovered Elements</w:t>
+            </w:r>
+          </w:p>
+        </w:tc>
+        <w:tc>
+          <w:tcPr>
+            <w:tcW w:type="dxa" w:w="4320"/>
+          </w:tcPr>
+          <w:p>
+            <w:r>
+              <w:t>0</w:t>
+            </w:r>
+          </w:p>
+        </w:tc>
+      </w:tr>
+      <w:tr>
+        <w:tc>
+          <w:tcPr>
+            <w:tcW w:type="dxa" w:w="4320"/>
+          </w:tcPr>
+          <w:p>
+            <w:r>
+              <w:t>Coverage Percentage</w:t>
+            </w:r>
+          </w:p>
+        </w:tc>
+        <w:tc>
+          <w:tcPr>
+            <w:tcW w:type="dxa" w:w="4320"/>
+          </w:tcPr>
+          <w:p>
+            <w:r>
+              <w:t>100.0%</w:t>
+            </w:r>
+          </w:p>
+        </w:tc>
+      </w:tr>
+      <w:tr>
+        <w:tc>
+          <w:tcPr>
+            <w:tcW w:type="dxa" w:w="4320"/>
+          </w:tcPr>
+          <w:p>
+            <w:r>
+              <w:t>Total Test Scripts</w:t>
+            </w:r>
+          </w:p>
+        </w:tc>
+        <w:tc>
+          <w:tcPr>
+            <w:tcW w:type="dxa" w:w="4320"/>
+          </w:tcPr>
+          <w:p>
+            <w:r>
+              <w:t>8</w:t>
+            </w:r>
+          </w:p>
+        </w:tc>
+      </w:tr>
+    </w:tbl>
+    <w:p/>
+    <w:p>
+      <w:pPr>
+        <w:pStyle w:val="Heading2"/>
+      </w:pPr>
+      <w:r>
+        <w:t>Tests by Priority</w:t>
+      </w:r>
+    </w:p>
+    <w:tbl>
+      <w:tblPr>
+        <w:tblStyle w:val="LightGrid-Accent1"/>
+        <w:tblW w:type="auto" w:w="0"/>
+        <w:tblLook w:firstColumn="1" w:firstRow="1" w:lastColumn="0" w:lastRow="0" w:noHBand="0" w:noVBand="1" w:val="04A0"/>
+      </w:tblPr>
+      <w:tblGrid>
+        <w:gridCol w:w="4320"/>
+        <w:gridCol w:w="4320"/>
+      </w:tblGrid>
+      <w:tr>
+        <w:tc>
+          <w:tcPr>
+            <w:tcW w:type="dxa" w:w="4320"/>
+          </w:tcPr>
+          <w:p>
+            <w:r>
+              <w:rPr>
+                <w:b/>
+              </w:rPr>
+              <w:t>Priority</w:t>
+            </w:r>
+          </w:p>
+        </w:tc>
+        <w:tc>
+          <w:tcPr>
+            <w:tcW w:type="dxa" w:w="4320"/>
+          </w:tcPr>
+          <w:p>
+            <w:r>
+              <w:rPr>
+                <w:b/>
+              </w:rPr>
+              <w:t>Count</w:t>
+            </w:r>
+          </w:p>
+        </w:tc>
+      </w:tr>
+      <w:tr>
+        <w:tc>
+          <w:tcPr>
+            <w:tcW w:type="dxa" w:w="4320"/>
+          </w:tcPr>
+          <w:p>
+            <w:r>
+              <w:t>Critical</w:t>
+            </w:r>
+          </w:p>
+        </w:tc>
+        <w:tc>
+          <w:tcPr>
+            <w:tcW w:type="dxa" w:w="4320"/>
+          </w:tcPr>
+          <w:p>
+            <w:r>
+              <w:t>1</w:t>
+            </w:r>
+          </w:p>
+        </w:tc>
+      </w:tr>
+      <w:tr>
+        <w:tc>
+          <w:tcPr>
+            <w:tcW w:type="dxa" w:w="4320"/>
+          </w:tcPr>
+          <w:p>
+            <w:r>
+              <w:t>High</w:t>
+            </w:r>
+          </w:p>
+        </w:tc>
+        <w:tc>
+          <w:tcPr>
+            <w:tcW w:type="dxa" w:w="4320"/>
+          </w:tcPr>
+          <w:p>
+            <w:r>
+              <w:t>4</w:t>
+            </w:r>
+          </w:p>
+        </w:tc>
+      </w:tr>
+      <w:tr>
+        <w:tc>
+          <w:tcPr>
+            <w:tcW w:type="dxa" w:w="4320"/>
+          </w:tcPr>
+          <w:p>
+            <w:r>
+              <w:t>Medium</w:t>
+            </w:r>
+          </w:p>
+        </w:tc>
+        <w:tc>
+          <w:tcPr>
+            <w:tcW w:type="dxa" w:w="4320"/>
+          </w:tcPr>
+          <w:p>
+            <w:r>
+              <w:t>3</w:t>
+            </w:r>
+          </w:p>
+        </w:tc>
+      </w:tr>
+    </w:tbl>
+    <w:p/>
+    <w:p>
+      <w:pPr>
+        <w:pStyle w:val="Heading2"/>
+      </w:pPr>
+      <w:r>
+        <w:t>User Flows Covered</w:t>
+      </w:r>
+    </w:p>
+    <w:p>
+      <w:pPr>
+        <w:pStyle w:val="ListBullet"/>
+      </w:pPr>
+      <w:r>
+        <w:t>✓ App Launch &amp; Element Visibility</w:t>
+      </w:r>
+    </w:p>
+    <w:p>
+      <w:pPr>
+        <w:pStyle w:val="ListBullet"/>
+      </w:pPr>
+      <w:r>
+        <w:t>✓ Greeting with Valid Name</w:t>
+      </w:r>
+    </w:p>
+    <w:p>
+      <w:pPr>
+        <w:pStyle w:val="ListBullet"/>
+      </w:pPr>
+      <w:r>
+        <w:t>✓ Greeting with Empty Name</w:t>
+      </w:r>
+    </w:p>
+    <w:p>
+      <w:pPr>
+        <w:pStyle w:val="ListBullet"/>
+      </w:pPr>
+      <w:r>
+        <w:t>✓ Counter Increment</w:t>
+      </w:r>
+    </w:p>
+    <w:p>
+      <w:pPr>
+        <w:pStyle w:val="ListBullet"/>
+      </w:pPr>
+      <w:r>
+        <w:t>✓ Counter Decrement (incl. negative)</w:t>
+      </w:r>
+    </w:p>
+    <w:p>
+      <w:pPr>
+        <w:pStyle w:val="ListBullet"/>
+      </w:pPr>
+      <w:r>
+        <w:t>✓ Counter Reset</w:t>
+      </w:r>
+    </w:p>
+    <w:p>
+      <w:pPr>
+        <w:pStyle w:val="ListBullet"/>
+      </w:pPr>
+      <w:r>
+        <w:t>✓ Greeting with Special Characters</w:t>
+      </w:r>
+    </w:p>
+    <w:p>
+      <w:pPr>
+        <w:pStyle w:val="ListBullet"/>
+      </w:pPr>
+      <w:r>
+        <w:t>✓ Counter Mixed Operations</w:t>
+      </w:r>
+    </w:p>
+    <w:p/>
+    <w:p>
+      <w:pPr>
+        <w:pStyle w:val="Heading1"/>
+      </w:pPr>
+      <w:r>
+        <w:t>Coverage Gaps</w:t>
       </w:r>
     </w:p>
     <w:p>
       <w:r>
-        <w:t>2. No input validation on empty name — tapping 'Say Hello' with empty field shows 'Hello, !' (UX issue).</w:t>
+        <w:t>No coverage gaps identified. All UI elements and user flows are covered by the test suite.</w:t>
+      </w:r>
+    </w:p>
+    <w:p/>
+    <w:p>
+      <w:pPr>
+        <w:pStyle w:val="Heading2"/>
+      </w:pPr>
+      <w:r>
+        <w:t>Notes</w:t>
+      </w:r>
+    </w:p>
+    <w:p>
+      <w:pPr>
+        <w:pStyle w:val="ListBullet"/>
+      </w:pPr>
+      <w:r>
+        <w:t>Calculator.kt is a utility class with no UI — excluded from E2E coverage (unit test candidate)</w:t>
+      </w:r>
+    </w:p>
+    <w:p>
+      <w:pPr>
+        <w:pStyle w:val="ListBullet"/>
+      </w:pPr>
+      <w:r>
+        <w:t>No navigation flows detected — single-screen app</w:t>
+      </w:r>
+    </w:p>
+    <w:p>
+      <w:pPr>
+        <w:pStyle w:val="ListBullet"/>
+      </w:pPr>
+      <w:r>
+        <w:t>All interactive elements have contentDescription set — good accessibility practice</w:t>
+      </w:r>
+    </w:p>
+    <w:p/>
+    <w:p>
+      <w:pPr>
+        <w:pStyle w:val="Heading1"/>
+      </w:pPr>
+      <w:r>
+        <w:t>Failure Details</w:t>
       </w:r>
     </w:p>
     <w:p>
       <w:r>
-        <w:t>3. Counter has no lower bound — can go negative. Worth noting if spec requires non-negative values.</w:t>
+        <w:t>No failures recorded in this test run.</w:t>
+      </w:r>
+    </w:p>
+    <w:p/>
+    <w:p/>
+    <w:p>
+      <w:pPr>
+        <w:jc w:val="center"/>
+      </w:pPr>
+      <w:r>
+        <w:rPr>
+          <w:color w:val="999999"/>
+          <w:sz w:val="18"/>
+        </w:rPr>
+        <w:t>Report generated: 2026-06-08 11:45:39</w:t>
       </w:r>
     </w:p>
     <w:p>
+      <w:pPr>
+        <w:jc w:val="center"/>
+      </w:pPr>
       <w:r>
-        <w:t>4. All UI elements have proper accessibility labels (contentDescription) for testability.</w:t>
+        <w:rPr>
+          <w:color w:val="999999"/>
+          <w:sz w:val="18"/>
+        </w:rPr>
+        <w:t>Generated by Kiro Mobile E2E Tester</w:t>
       </w:r>
     </w:p>
     <w:sectPr>

</xml_diff>